<commit_message>
Unit 5 reflection - updated with extra task
</commit_message>
<xml_diff>
--- a/SubPages/Security_Risk/docs/Unit5_Reflection.docx
+++ b/SubPages/Security_Risk/docs/Unit5_Reflection.docx
@@ -52,7 +52,7 @@
           <w:i w:val="false"/>
           <w:iCs w:val="false"/>
         </w:rPr>
-        <w:t xml:space="preserve">Unit 5 moved from the techniques of risk assessment to the standards around them. The readings were Aven and Thekdi’s (2025) chapter on the basic theory of risk management, Barafort, Mesquida and Mas’s (2019) integrated risk management process model built on ISO 31000, Sutton’s (2021) appendix on HM Government cyber security guidance, Kirvan’s (2025) overview of fifteen common security frameworks and standards, and Adhillah et al.’s (2025) systematic review of enterprise risk management (ERM). I used them to revisit the standards cited in our Pampered Pets report and to produce the standards register and threat-to-control mapping below.</w:t>
+        <w:t xml:space="preserve">Unit 5 moved from the techniques of risk assessment to the standards around them. The readings were Aven and Thekdi’s (2025) chapter on the basic theory of risk management, Barafort, Mesquida and Mas’s (2019) integrated risk management process model built on ISO 31000, Sutton’s (2021) appendix on HM Government cyber security guidance, Kirvan’s (2025) overview of fifteen common security frameworks and standards, and Adhillah et al.’s (2025) systematic review of enterprise risk management (ERM). I used them to revisit the standards cited in our Pampered Pets report and to produce the standards register and threat-to-control mapping below, and I analysed a pre-GDPR case from the Irish Data Protection Commission for the seminar.</w:t>
       </w:r>
     </w:p>
     <w:p>
@@ -73,7 +73,7 @@
           <w:i w:val="false"/>
           <w:iCs w:val="false"/>
         </w:rPr>
-        <w:t xml:space="preserve">The first thing I had to correct was my own vocabulary. In the group report we used ‘standard’ for anything with an acronym. Kirvan (2025) separates frameworks, which often carry no compliance requirement, from standards and regulations, which do. Applied to Pampered Pets, our list splits three ways. The GDPR is law, and Article 32 requires security ‘appropriate to the risk’ (Art. 32 GDPR, no date). PCI DSS is not law, but it binds any business that accepts card payments through its agreement with the card schemes (PCI Security Standards Council, 2024). ISO 31000 and ISO/IEC 27005, which we presented as our methodology, are guidance that nobody would ever audit the business against. Our report reduced the GDPR to a single ‘regulatory non-compliance’ row with a low likelihood rating, and PCI DSS to one bullet point among the digitalisation mitigations. The order was backwards: obligations fix part of the risk criteria, so they should be identified before any threat is scored.</w:t>
+        <w:t xml:space="preserve">The first thing I had to correct was my own vocabulary. In the group report we used ‘standard’ for anything with an acronym. Kirvan (2025) separates frameworks, which often carry no compliance requirement, from standards and regulations, which do. Applied to Pampered Pets, our list splits three ways. The GDPR is law, and Article 32 requires security ‘appropriate to the risk’ (Regulation (EU) 2016/679, art. 32). PCI DSS is not law, but it binds any business that accepts card payments through its agreement with the card schemes (PCI Security Standards Council, 2024). ISO 31000 and ISO/IEC 27005, which we presented as our methodology, are guidance that nobody would ever audit the business against. Our report reduced the GDPR to a single ‘regulatory non-compliance’ row with a low likelihood rating, and PCI DSS to one bullet point among the digitalisation mitigations. The order was backwards: obligations fix part of the risk criteria, so they should be identified before any threat is scored.</w:t>
       </w:r>
     </w:p>
     <w:p>
@@ -358,7 +358,7 @@
                 <w:sz w:val="20"/>
                 <w:szCs w:val="20"/>
               </w:rPr>
-              <w:t xml:space="preserve">Customer profiles, delivery addresses and CRM data are personal data. Article 32 requires security appropriate to the risk (Art. 32 GDPR, no date).</w:t>
+              <w:t xml:space="preserve">Customer profiles, delivery addresses and CRM data are personal data. Article 32 requires security appropriate to the risk (Regulation (EU) 2016/679, art. 32).</w:t>
             </w:r>
           </w:p>
         </w:tc>
@@ -1300,6 +1300,287 @@
         <w:pStyle w:val="Heading1"/>
       </w:pPr>
       <w:r>
+        <w:t xml:space="preserve">GDPR Case Study: Access Restrictions on Employee Health Data</w:t>
+      </w:r>
+    </w:p>
+    <w:p>
+      <w:pPr>
+        <w:spacing w:after="160"/>
+      </w:pPr>
+      <w:r>
+        <w:rPr>
+          <w:i/>
+          <w:iCs/>
+          <w:color w:val="555555"/>
+        </w:rPr>
+        <w:t xml:space="preserve">Prepared for discussion at next week’s seminar. Case: ‘Failure by the Department of Justice and Equality to impose the correct access restrictions on access to medical data of an employee’ (Data Protection Commission, 2020).</w:t>
+      </w:r>
+    </w:p>
+    <w:p>
+      <w:pPr>
+        <w:pStyle w:val="Heading2"/>
+      </w:pPr>
+      <w:r>
+        <w:t xml:space="preserve">The case</w:t>
+      </w:r>
+    </w:p>
+    <w:p>
+      <w:pPr>
+        <w:spacing w:after="160" w:line="300"/>
+        <w:jc w:val="both"/>
+      </w:pPr>
+      <w:r>
+        <w:rPr>
+          <w:i w:val="false"/>
+          <w:iCs w:val="false"/>
+        </w:rPr>
+        <w:t xml:space="preserve">An employee of the Department of Justice and Equality complained that a report about their health had been uploaded in 2012 to a general departmental document management database, where it stayed for up to three years and could be opened by around 80 colleagues. They found out from a colleague, not from the Department. The document was a line manager’s notes of a discussion with the employee. It had been marked private, but the manager had not applied the access restriction. The Department could not explain why the notes were saved to that database, and could not say how many staff had opened them because its IT section was unable to restore the historic data (Data Protection Commission, 2020).</w:t>
+      </w:r>
+    </w:p>
+    <w:p>
+      <w:pPr>
+        <w:pStyle w:val="Heading2"/>
+      </w:pPr>
+      <w:r>
+        <w:t xml:space="preserve">1. What is the specific aspect of GDPR that your case study addresses?</w:t>
+      </w:r>
+    </w:p>
+    <w:p>
+      <w:pPr>
+        <w:spacing w:after="160" w:line="300"/>
+        <w:jc w:val="both"/>
+      </w:pPr>
+      <w:r>
+        <w:rPr>
+          <w:i w:val="false"/>
+          <w:iCs w:val="false"/>
+        </w:rPr>
+        <w:t xml:space="preserve">The case was decided under the Data Protection Acts 1988 and 2003, and the Commissioner found breaches of section 2A(1), the need for a legal basis to process personal data, and section 2B(1), the additional conditions for sensitive personal data (Data Protection Commission, 2020). Under the GDPR the same facts engage the rules on special category data. Health data falls under Article 9, and an employer can hold it where this is needed for employment or occupational health purposes (Regulation (EU) 2016/679, art. 9). The Department probably had a valid reason to keep the notes. It had no reason to make them available to 80 people, and a legal basis for one purpose does not cover every later disclosure.</w:t>
+      </w:r>
+    </w:p>
+    <w:p>
+      <w:pPr>
+        <w:spacing w:after="160" w:line="300"/>
+        <w:jc w:val="both"/>
+      </w:pPr>
+      <w:r>
+        <w:rPr>
+          <w:i w:val="false"/>
+          <w:iCs w:val="false"/>
+        </w:rPr>
+        <w:t xml:space="preserve">The aspect I think the case really addresses is confidentiality by design. Article 5(1)(f) requires personal data to be protected against unauthorised processing, and Article 32 requires security appropriate to the risk. Article 25(2) is more specific: by default, personal data must not be ‘made accessible without the individual’s intervention to an indefinite number of natural persons’ (Regulation (EU) 2016/679, arts. 5, 25 and 32). The Department’s system did the opposite. Documents were open unless the author remembered to close them, so a single missed setting exposed the data. The case also touches accountability. Because the Department could not reconstruct who had opened the file, it could not show the extent of the harm. Under the GDPR the exposure would be a personal data breach that the controller had to document, report to the supervisory authority within 72 hours unless it was unlikely to cause risk, and, because exposed health data is likely to be high risk, communicate to the employee (Regulation (EU) 2016/679, arts. 33 and 34).</w:t>
+      </w:r>
+    </w:p>
+    <w:p>
+      <w:pPr>
+        <w:pStyle w:val="Heading2"/>
+      </w:pPr>
+      <w:r>
+        <w:t xml:space="preserve">2. How was it resolved?</w:t>
+      </w:r>
+    </w:p>
+    <w:p>
+      <w:pPr>
+        <w:spacing w:after="160" w:line="300"/>
+        <w:jc w:val="both"/>
+      </w:pPr>
+      <w:r>
+        <w:rPr>
+          <w:i w:val="false"/>
+          <w:iCs w:val="false"/>
+        </w:rPr>
+        <w:t xml:space="preserve">The Department removed the document from the database, around three years after it had been saved there, and put the incident down to human error by the line manager. It offered to settle the complaint amicably, but the employee declined and asked for a formal decision. The Commissioner found that the Department had contravened sections 2A(1) and 2B(1) by processing the employee’s sensitive personal data without consent or another legal basis, and by disclosing it to at least one third party. The decision added that regular audit and review of documents stored on open databases would have found the file much sooner, and that adequate training and awareness for managers might have stopped the problem arising at all (Data Protection Commission, 2020).</w:t>
+      </w:r>
+    </w:p>
+    <w:p>
+      <w:pPr>
+        <w:spacing w:after="160" w:line="300"/>
+        <w:jc w:val="both"/>
+      </w:pPr>
+      <w:r>
+        <w:rPr>
+          <w:i w:val="false"/>
+          <w:iCs w:val="false"/>
+        </w:rPr>
+        <w:t xml:space="preserve">The case study records no sanction beyond the decision itself. To my mind that is the weakest part of the outcome. The decision recognised the harm, but the employee’s data had been exposed for three years, the employee discovered it themselves, and nobody could tell them who had read it. Under the GDPR the same facts could lead to corrective orders or an administrative fine under Article 83, and the employee would very probably have had to be told directly.</w:t>
+      </w:r>
+    </w:p>
+    <w:p>
+      <w:pPr>
+        <w:pStyle w:val="Heading2"/>
+      </w:pPr>
+      <w:r>
+        <w:t xml:space="preserve">3. If this was your organisation, what steps would you take as an Information Security Manager to mitigate the issue?</w:t>
+      </w:r>
+    </w:p>
+    <w:p>
+      <w:pPr>
+        <w:spacing w:after="160" w:line="300"/>
+        <w:jc w:val="both"/>
+      </w:pPr>
+      <w:r>
+        <w:rPr>
+          <w:b/>
+          <w:bCs/>
+          <w:i w:val="false"/>
+          <w:iCs w:val="false"/>
+        </w:rPr>
+        <w:t xml:space="preserve">Immediate response.</w:t>
+      </w:r>
+      <w:r>
+        <w:rPr>
+          <w:i w:val="false"/>
+          <w:iCs w:val="false"/>
+        </w:rPr>
+        <w:t xml:space="preserve"> Restrict the document at once and preserve whatever access logs exist. Record the incident in the breach register, assess the risk and, as health data seen by many colleagues is unlikely to be risk-free, notify the regulator within 72 hours. Tell the employee directly what happened, what has been done and who to contact, rather than leaving them to find out from a colleague. Then search the rest of the repository for other health or HR documents, because one misplaced file usually means others.</w:t>
+      </w:r>
+    </w:p>
+    <w:p>
+      <w:pPr>
+        <w:spacing w:after="160" w:line="300"/>
+        <w:jc w:val="both"/>
+      </w:pPr>
+      <w:r>
+        <w:rPr>
+          <w:b/>
+          <w:bCs/>
+          <w:i w:val="false"/>
+          <w:iCs w:val="false"/>
+        </w:rPr>
+        <w:t xml:space="preserve">Fix the cause.</w:t>
+      </w:r>
+      <w:r>
+        <w:rPr>
+          <w:i w:val="false"/>
+          <w:iCs w:val="false"/>
+        </w:rPr>
+        <w:t xml:space="preserve"> I would not accept ‘human error’ as the root cause, because a process that depends on every manager remembering one setting will fail eventually. The technical changes come first:</w:t>
+      </w:r>
+    </w:p>
+    <w:p>
+      <w:pPr>
+        <w:spacing w:after="80" w:line="300"/>
+        <w:ind w:left="567" w:hanging="283"/>
+        <w:jc w:val="both"/>
+      </w:pPr>
+      <w:r>
+        <w:rPr>
+          <w:i w:val="false"/>
+          <w:iCs w:val="false"/>
+        </w:rPr>
+        <w:t xml:space="preserve">•	</w:t>
+      </w:r>
+      <w:r>
+        <w:rPr>
+          <w:i w:val="false"/>
+          <w:iCs w:val="false"/>
+        </w:rPr>
+        <w:t xml:space="preserve">Move HR and occupational health records out of the general document system into an HR system that only HR and the relevant manager can access (ISO, 2022, A.5.15 and A.8.3).</w:t>
+      </w:r>
+    </w:p>
+    <w:p>
+      <w:pPr>
+        <w:spacing w:after="80" w:line="300"/>
+        <w:ind w:left="567" w:hanging="283"/>
+        <w:jc w:val="both"/>
+      </w:pPr>
+      <w:r>
+        <w:rPr>
+          <w:i w:val="false"/>
+          <w:iCs w:val="false"/>
+        </w:rPr>
+        <w:t xml:space="preserve">•	</w:t>
+      </w:r>
+      <w:r>
+        <w:rPr>
+          <w:i w:val="false"/>
+          <w:iCs w:val="false"/>
+        </w:rPr>
+        <w:t xml:space="preserve">Make private the default for new documents, so that sharing more widely is a deliberate act, as Article 25(2) requires.</w:t>
+      </w:r>
+    </w:p>
+    <w:p>
+      <w:pPr>
+        <w:spacing w:after="80" w:line="300"/>
+        <w:ind w:left="567" w:hanging="283"/>
+        <w:jc w:val="both"/>
+      </w:pPr>
+      <w:r>
+        <w:rPr>
+          <w:i w:val="false"/>
+          <w:iCs w:val="false"/>
+        </w:rPr>
+        <w:t xml:space="preserve">•	</w:t>
+      </w:r>
+      <w:r>
+        <w:rPr>
+          <w:i w:val="false"/>
+          <w:iCs w:val="false"/>
+        </w:rPr>
+        <w:t xml:space="preserve">Introduce a classification scheme with a ‘Confidential – HR/Health’ label that applies restrictive permissions automatically (A.5.12 and A.5.13), backed by data leakage prevention rules that flag health information saved to open areas (A.8.12).</w:t>
+      </w:r>
+    </w:p>
+    <w:p>
+      <w:pPr>
+        <w:spacing w:after="80" w:line="300"/>
+        <w:ind w:left="567" w:hanging="283"/>
+        <w:jc w:val="both"/>
+      </w:pPr>
+      <w:r>
+        <w:rPr>
+          <w:i w:val="false"/>
+          <w:iCs w:val="false"/>
+        </w:rPr>
+        <w:t xml:space="preserve">•	</w:t>
+      </w:r>
+      <w:r>
+        <w:rPr>
+          <w:i w:val="false"/>
+          <w:iCs w:val="false"/>
+        </w:rPr>
+        <w:t xml:space="preserve">Log access to confidential repositories and keep the logs long enough to answer the question the Department could not: who opened the file (A.8.15).</w:t>
+      </w:r>
+    </w:p>
+    <w:p>
+      <w:pPr>
+        <w:spacing w:after="160" w:line="300"/>
+        <w:jc w:val="both"/>
+      </w:pPr>
+      <w:r>
+        <w:rPr>
+          <w:b/>
+          <w:bCs/>
+          <w:i w:val="false"/>
+          <w:iCs w:val="false"/>
+        </w:rPr>
+        <w:t xml:space="preserve">Assurance and people.</w:t>
+      </w:r>
+      <w:r>
+        <w:rPr>
+          <w:i w:val="false"/>
+          <w:iCs w:val="false"/>
+        </w:rPr>
+        <w:t xml:space="preserve"> Run a scheduled scan and access review of open repositories and report the results to senior management, which meets the Article 32(1)(d) requirement to test and evaluate security measures regularly. Give targeted training to line managers, who create most of these notes, rather than relying on general awareness modules (A.6.3). Set a retention period for notes of this kind, and run a lessons-learned review after the incident (A.5.27).</w:t>
+      </w:r>
+    </w:p>
+    <w:p>
+      <w:pPr>
+        <w:spacing w:after="160" w:line="300"/>
+        <w:jc w:val="both"/>
+      </w:pPr>
+      <w:r>
+        <w:rPr>
+          <w:i w:val="false"/>
+          <w:iCs w:val="false"/>
+        </w:rPr>
+        <w:t xml:space="preserve">The case is relevant to Pampered Pets as well. A small business with shared PCs and no access roles could easily end up keeping staff records in the same shared folders as its stock spreadsheets. Cyber Essentials controls user accounts but not who can open a particular document, so document-level access to staff data is a UK GDPR item that the standards register has to cover separately.</w:t>
+      </w:r>
+    </w:p>
+    <w:p>
+      <w:pPr>
+        <w:pStyle w:val="Heading1"/>
+      </w:pPr>
+      <w:r>
         <w:t xml:space="preserve">References</w:t>
       </w:r>
     </w:p>
@@ -1355,65 +1636,23 @@
           <w:i w:val="false"/>
           <w:iCs w:val="false"/>
         </w:rPr>
-        <w:t xml:space="preserve">Art. 32 GDPR – Security of processing (no date) </w:t>
+        <w:t xml:space="preserve">Aven, T. and Thekdi, S. (2025) </w:t>
       </w:r>
       <w:r>
         <w:rPr>
           <w:i/>
           <w:iCs/>
         </w:rPr>
-        <w:t xml:space="preserve">General Data Protection Regulation (GDPR)</w:t>
-      </w:r>
-      <w:r>
-        <w:rPr>
-          <w:i w:val="false"/>
-          <w:iCs w:val="false"/>
-        </w:rPr>
-        <w:t xml:space="preserve">. Available at: </w:t>
+        <w:t xml:space="preserve">Risk science: an introduction</w:t>
+      </w:r>
+      <w:r>
+        <w:rPr>
+          <w:i w:val="false"/>
+          <w:iCs w:val="false"/>
+        </w:rPr>
+        <w:t xml:space="preserve">. 2nd edn. Abingdon: Routledge. Chapter 8: Basic theory of risk management. Available at: </w:t>
       </w:r>
       <w:hyperlink w:history="1" r:id="rIdU5ref1">
-        <w:r>
-          <w:rPr>
-            <w:rStyle w:val="Hyperlink"/>
-          </w:rPr>
-          <w:t xml:space="preserve">https://gdpr-info.eu/art-32-gdpr/</w:t>
-        </w:r>
-      </w:hyperlink>
-      <w:r>
-        <w:rPr>
-          <w:i w:val="false"/>
-          <w:iCs w:val="false"/>
-        </w:rPr>
-        <w:t xml:space="preserve"> (Accessed: 3 October 2026).</w:t>
-      </w:r>
-    </w:p>
-    <w:p>
-      <w:pPr>
-        <w:spacing w:after="120"/>
-        <w:ind w:left="567" w:hanging="567"/>
-      </w:pPr>
-      <w:r>
-        <w:rPr>
-          <w:i w:val="false"/>
-          <w:iCs w:val="false"/>
-        </w:rPr>
-        <w:t xml:space="preserve">Aven, T. and Thekdi, S. (2025) </w:t>
-      </w:r>
-      <w:r>
-        <w:rPr>
-          <w:i/>
-          <w:iCs/>
-        </w:rPr>
-        <w:t xml:space="preserve">Risk science: an introduction</w:t>
-      </w:r>
-      <w:r>
-        <w:rPr>
-          <w:i w:val="false"/>
-          <w:iCs w:val="false"/>
-        </w:rPr>
-        <w:t xml:space="preserve">. 2nd edn. Abingdon: Routledge. Chapter 8: Basic theory of risk management. Available at: </w:t>
-      </w:r>
-      <w:hyperlink w:history="1" r:id="rIdU5ref2">
         <w:r>
           <w:rPr>
             <w:rStyle w:val="Hyperlink"/>
@@ -1455,7 +1694,7 @@
         </w:rPr>
         <w:t xml:space="preserve">, 189, pp. 279–286. Available at: </w:t>
       </w:r>
-      <w:hyperlink w:history="1" r:id="rIdU5ref3">
+      <w:hyperlink w:history="1" r:id="rIdU5ref2">
         <w:r>
           <w:rPr>
             <w:rStyle w:val="Hyperlink"/>
@@ -1497,12 +1736,54 @@
         </w:rPr>
         <w:t xml:space="preserve">, 31(1), e1984. Available at: </w:t>
       </w:r>
+      <w:hyperlink w:history="1" r:id="rIdU5ref3">
+        <w:r>
+          <w:rPr>
+            <w:rStyle w:val="Hyperlink"/>
+          </w:rPr>
+          <w:t xml:space="preserve">https://doi.org/10.1002/smr.1984</w:t>
+        </w:r>
+      </w:hyperlink>
+      <w:r>
+        <w:rPr>
+          <w:i w:val="false"/>
+          <w:iCs w:val="false"/>
+        </w:rPr>
+        <w:t xml:space="preserve"> (Accessed: 3 October 2026).</w:t>
+      </w:r>
+    </w:p>
+    <w:p>
+      <w:pPr>
+        <w:spacing w:after="120"/>
+        <w:ind w:left="567" w:hanging="567"/>
+      </w:pPr>
+      <w:r>
+        <w:rPr>
+          <w:i w:val="false"/>
+          <w:iCs w:val="false"/>
+        </w:rPr>
+        <w:t xml:space="preserve">Data Protection Commission (2020) </w:t>
+      </w:r>
+      <w:r>
+        <w:rPr>
+          <w:i/>
+          <w:iCs/>
+        </w:rPr>
+        <w:t xml:space="preserve">Case studies pre-GDPR</w:t>
+      </w:r>
+      <w:r>
+        <w:rPr>
+          <w:i w:val="false"/>
+          <w:iCs w:val="false"/>
+        </w:rPr>
+        <w:t xml:space="preserve">. Dublin: Data Protection Commission. Available at: </w:t>
+      </w:r>
       <w:hyperlink w:history="1" r:id="rIdU5ref4">
         <w:r>
           <w:rPr>
             <w:rStyle w:val="Hyperlink"/>
           </w:rPr>
-          <w:t xml:space="preserve">https://doi.org/10.1002/smr.1984</w:t>
+          <w:t xml:space="preserve">https://www.dataprotection.ie/en/pre-gdpr/case-studies</w:t>
         </w:r>
       </w:hyperlink>
       <w:r>
@@ -1817,21 +2098,36 @@
           <w:i w:val="false"/>
           <w:iCs w:val="false"/>
         </w:rPr>
-        <w:t xml:space="preserve">Rolfe, G., Freshwater, D. and Jasper, M. (2001) </w:t>
+        <w:t xml:space="preserve">Regulation (EU) 2016/679 of the European Parliament and of the Council of 27 April 2016 on the protection of natural persons with regard to the processing of personal data and on the free movement of such data, and repealing Directive 95/46/EC (General Data Protection Regulation). </w:t>
       </w:r>
       <w:r>
         <w:rPr>
           <w:i/>
           <w:iCs/>
         </w:rPr>
-        <w:t xml:space="preserve">Critical reflection in nursing and the helping professions: a user’s guide</w:t>
-      </w:r>
-      <w:r>
-        <w:rPr>
-          <w:i w:val="false"/>
-          <w:iCs w:val="false"/>
-        </w:rPr>
-        <w:t xml:space="preserve">. Basingstoke: Palgrave Macmillan.</w:t>
+        <w:t xml:space="preserve">Official Journal of the European Union</w:t>
+      </w:r>
+      <w:r>
+        <w:rPr>
+          <w:i w:val="false"/>
+          <w:iCs w:val="false"/>
+        </w:rPr>
+        <w:t xml:space="preserve">, L 119, 4 May, pp. 1–88. Available at: </w:t>
+      </w:r>
+      <w:hyperlink w:history="1" r:id="rIdU5ref12">
+        <w:r>
+          <w:rPr>
+            <w:rStyle w:val="Hyperlink"/>
+          </w:rPr>
+          <w:t xml:space="preserve">https://eur-lex.europa.eu/eli/reg/2016/679/oj</w:t>
+        </w:r>
+      </w:hyperlink>
+      <w:r>
+        <w:rPr>
+          <w:i w:val="false"/>
+          <w:iCs w:val="false"/>
+        </w:rPr>
+        <w:t xml:space="preserve"> (Accessed: 3 October 2026).</w:t>
       </w:r>
     </w:p>
     <w:p>
@@ -1844,13 +2140,40 @@
           <w:i w:val="false"/>
           <w:iCs w:val="false"/>
         </w:rPr>
-        <w:t xml:space="preserve">Sutton, D. (2021) </w:t>
+        <w:t xml:space="preserve">Rolfe, G., Freshwater, D. and Jasper, M. (2001) </w:t>
       </w:r>
       <w:r>
         <w:rPr>
           <w:i/>
           <w:iCs/>
         </w:rPr>
+        <w:t xml:space="preserve">Critical reflection in nursing and the helping professions: a user’s guide</w:t>
+      </w:r>
+      <w:r>
+        <w:rPr>
+          <w:i w:val="false"/>
+          <w:iCs w:val="false"/>
+        </w:rPr>
+        <w:t xml:space="preserve">. Basingstoke: Palgrave Macmillan.</w:t>
+      </w:r>
+    </w:p>
+    <w:p>
+      <w:pPr>
+        <w:spacing w:after="120"/>
+        <w:ind w:left="567" w:hanging="567"/>
+      </w:pPr>
+      <w:r>
+        <w:rPr>
+          <w:i w:val="false"/>
+          <w:iCs w:val="false"/>
+        </w:rPr>
+        <w:t xml:space="preserve">Sutton, D. (2021) </w:t>
+      </w:r>
+      <w:r>
+        <w:rPr>
+          <w:i/>
+          <w:iCs/>
+        </w:rPr>
         <w:t xml:space="preserve">Information risk management: a practitioner’s guide</w:t>
       </w:r>
       <w:r>
@@ -1860,7 +2183,7 @@
         </w:rPr>
         <w:t xml:space="preserve">. 2nd edn. Swindon: BCS, The Chartered Institute for IT. Appendix G: HMG cyber security guidelines. Available at: </w:t>
       </w:r>
-      <w:hyperlink w:history="1" r:id="rIdU5ref12">
+      <w:hyperlink w:history="1" r:id="rIdU5ref13">
         <w:r>
           <w:rPr>
             <w:rStyle w:val="Hyperlink"/>

</xml_diff>